<commit_message>
Update CV achievements and add PDF and Word downloads
</commit_message>
<xml_diff>
--- a/assets/Ahmed_Darweesh_CV.docx
+++ b/assets/Ahmed_Darweesh_CV.docx
@@ -127,7 +127,7 @@
         <w:ind w:left="259" w:hanging="173"/>
       </w:pPr>
       <w:r>
-        <w:t>Reduced machine downtime by 35%, improved the overall manufacturing defect rate by 22%, and reduced Tablet defects from approximately 24,000 PPM to 6,000 PPM.</w:t>
+        <w:t>Reduced machine downtime by 35%, improved the overall manufacturing defect rate by 22%, and reduced Tablet defects from approximately 24,000 PPM to 6,000 PPM (75% reduction in Tablet defect PPM).</w:t>
       </w:r>
     </w:p>
     <w:p>
@@ -149,7 +149,7 @@
         <w:ind w:left="259" w:hanging="173"/>
       </w:pPr>
       <w:r>
-        <w:t>Received the Samsung Global Innovation Day Award in 2022 for manufacturing innovation and engineering excellence.</w:t>
+        <w:t>Received two Samsung Global Innovation Day Awards, in 2019 and 2022, for manufacturing innovation and engineering excellence.</w:t>
       </w:r>
     </w:p>
     <w:p>
@@ -244,7 +244,7 @@
         <w:ind w:left="259" w:hanging="173"/>
       </w:pPr>
       <w:r>
-        <w:t>Reduced spare-parts cost by 15% through planning, localization, inventory control, and demand forecasting.</w:t>
+        <w:t>Reduced spare-parts cost by 15% through planning, localization, inventory control, and demand forecasting. Built and developed maintenance teams through recruitment, technical training, coaching, and structured capability development.</w:t>
       </w:r>
     </w:p>
     <w:p>
@@ -310,7 +310,7 @@
         <w:ind w:left="259" w:hanging="173"/>
       </w:pPr>
       <w:r>
-        <w:t>Reduced Tablet defects from approximately 24,000 PPM to 6,000 PPM through incoming-quality controls, defect mapping, root-cause analysis, and team engagement.</w:t>
+        <w:t>Reduced Tablet defects from approximately 24,000 PPM to 6,000 PPM (75% reduction in Tablet defect PPM) through incoming-quality controls, defect mapping, root-cause analysis, and team engagement.</w:t>
       </w:r>
     </w:p>
     <w:p>
@@ -354,7 +354,7 @@
         <w:ind w:left="259" w:hanging="173"/>
       </w:pPr>
       <w:r>
-        <w:t>Directed Production Technology and Manufacturing Engineering across TV Final Assembly, LCM, Press, and CKD/SKD/MKD operations, leading 53 engineers and technicians.</w:t>
+        <w:t>Directed Production Technology and Manufacturing Engineering across TV Final Assembly, LCM, Press, and CKD/SKD/MKD operations, leading 53 engineers and technicians. Recruited, trained, and developed the founding 53-person engineering and technician organization.</w:t>
       </w:r>
     </w:p>
     <w:p>
@@ -376,7 +376,7 @@
         <w:ind w:left="259" w:hanging="173"/>
       </w:pPr>
       <w:r>
-        <w:t>Commissioned 14 production lines and achieved the target production capacity of 12,000 units per day on schedule.</w:t>
+        <w:t>Commissioned 14 production lines, including seven TV Main Assembly and seven LCM lines, and achieved the target production capacity of 12,000 units per day on schedule.</w:t>
       </w:r>
     </w:p>
     <w:p>

</xml_diff>

<commit_message>
Synchronize downloadable Word and PDF CV experience with portfolio
</commit_message>
<xml_diff>
--- a/assets/Ahmed_Darweesh_CV.docx
+++ b/assets/Ahmed_Darweesh_CV.docx
@@ -45,9 +45,6 @@
       <w:pPr>
         <w:keepNext/>
         <w:spacing w:before="90" w:after="50"/>
-        <w:pBdr>
-          <w:bottom w:val="single" w:sz="5" w:space="1" w:color="666666"/>
-        </w:pBdr>
       </w:pPr>
       <w:r>
         <w:rPr>
@@ -68,9 +65,6 @@
       <w:pPr>
         <w:keepNext/>
         <w:spacing w:before="90" w:after="50"/>
-        <w:pBdr>
-          <w:bottom w:val="single" w:sz="5" w:space="1" w:color="666666"/>
-        </w:pBdr>
       </w:pPr>
       <w:r>
         <w:rPr>
@@ -94,9 +88,6 @@
       <w:pPr>
         <w:keepNext/>
         <w:spacing w:before="90" w:after="50"/>
-        <w:pBdr>
-          <w:bottom w:val="single" w:sz="5" w:space="1" w:color="666666"/>
-        </w:pBdr>
       </w:pPr>
       <w:r>
         <w:rPr>
@@ -156,9 +147,6 @@
       <w:pPr>
         <w:keepNext/>
         <w:spacing w:before="90" w:after="50"/>
-        <w:pBdr>
-          <w:bottom w:val="single" w:sz="5" w:space="1" w:color="666666"/>
-        </w:pBdr>
       </w:pPr>
       <w:r>
         <w:rPr>
@@ -173,31 +161,29 @@
     <w:p>
       <w:pPr>
         <w:keepNext/>
-        <w:spacing w:before="64" w:after="10"/>
+        <w:spacing w:before="120"/>
       </w:pPr>
       <w:r>
         <w:rPr>
           <w:b/>
-          <w:sz w:val="19"/>
         </w:rPr>
         <w:t>Maintenance and Innovation Senior Manager | Samsung Electronics Egypt</w:t>
       </w:r>
+    </w:p>
+    <w:p>
+      <w:pPr>
+        <w:keepNext/>
+      </w:pPr>
       <w:r>
         <w:rPr>
           <w:i/>
-          <w:color w:val="464646"/>
-          <w:sz w:val="17"/>
         </w:rPr>
-        <w:br/>
-        <w:t>Beni Suef, Egypt | Jan 2025 - Present</w:t>
+        <w:t>Beni Suef, Egypt | Jan 2025 – Present</w:t>
       </w:r>
     </w:p>
     <w:p>
       <w:pPr>
         <w:pStyle w:val="ListBullet"/>
-        <w:keepLines/>
-        <w:spacing w:after="20"/>
-        <w:ind w:left="259" w:hanging="173"/>
       </w:pPr>
       <w:r>
         <w:t>Lead maintenance and reliability operations across 42 production lines covering TV Assembly, LCM, Press, Injection, EPS, Bonding, and Powder Coating, directing 54 engineers and technicians.</w:t>
@@ -206,9 +192,6 @@
     <w:p>
       <w:pPr>
         <w:pStyle w:val="ListBullet"/>
-        <w:keepLines/>
-        <w:spacing w:after="20"/>
-        <w:ind w:left="259" w:hanging="173"/>
       </w:pPr>
       <w:r>
         <w:t>Manage approximately US$1.5M in annual CAPEX and spare-parts expenditure and coordinate equipment upgrades with Production, Quality, Engineering, Supply Chain, and suppliers.</w:t>
@@ -217,9 +200,6 @@
     <w:p>
       <w:pPr>
         <w:pStyle w:val="ListBullet"/>
-        <w:keepLines/>
-        <w:spacing w:after="20"/>
-        <w:ind w:left="259" w:hanging="173"/>
       </w:pPr>
       <w:r>
         <w:t>Led installation, commissioning, maintenance setup, and production stabilization for new Bonding and Powder Coating technologies through quality audit and mass-production release.</w:t>
@@ -228,9 +208,6 @@
     <w:p>
       <w:pPr>
         <w:pStyle w:val="ListBullet"/>
-        <w:keepLines/>
-        <w:spacing w:after="20"/>
-        <w:ind w:left="259" w:hanging="173"/>
       </w:pPr>
       <w:r>
         <w:t>Established preventive and predictive maintenance strategies for equipment platforms with no previous maintenance history, improving MTBF by 21%.</w:t>
@@ -239,42 +216,45 @@
     <w:p>
       <w:pPr>
         <w:pStyle w:val="ListBullet"/>
-        <w:keepLines/>
-        <w:spacing w:after="20"/>
-        <w:ind w:left="259" w:hanging="173"/>
       </w:pPr>
       <w:r>
-        <w:t>Reduced spare-parts cost by 15% through planning, localization, inventory control, and demand forecasting. Built and developed maintenance teams through recruitment, technical training, coaching, and structured capability development.</w:t>
+        <w:t>Reduced spare-parts cost by 15% through planning, localization, inventory control, and demand forecasting.</w:t>
+      </w:r>
+    </w:p>
+    <w:p>
+      <w:pPr>
+        <w:pStyle w:val="ListBullet"/>
+      </w:pPr>
+      <w:r>
+        <w:t>Built and developed maintenance teams through recruitment, technical training, coaching, and structured capability development.</w:t>
       </w:r>
     </w:p>
     <w:p>
       <w:pPr>
         <w:keepNext/>
-        <w:spacing w:before="64" w:after="10"/>
+        <w:spacing w:before="120"/>
       </w:pPr>
       <w:r>
         <w:rPr>
           <w:b/>
-          <w:sz w:val="19"/>
         </w:rPr>
         <w:t>Mobile Manufacturing Senior Manager | Samsung Electronics Egypt</w:t>
       </w:r>
+    </w:p>
+    <w:p>
+      <w:pPr>
+        <w:keepNext/>
+      </w:pPr>
       <w:r>
         <w:rPr>
           <w:i/>
-          <w:color w:val="464646"/>
-          <w:sz w:val="17"/>
         </w:rPr>
-        <w:br/>
-        <w:t>Beni Suef, Egypt | Aug 2023 - Jan 2025</w:t>
+        <w:t>Beni Suef, Egypt | Aug 2023 – Jan 2025</w:t>
       </w:r>
     </w:p>
     <w:p>
       <w:pPr>
         <w:pStyle w:val="ListBullet"/>
-        <w:keepLines/>
-        <w:spacing w:after="20"/>
-        <w:ind w:left="259" w:hanging="173"/>
       </w:pPr>
       <w:r>
         <w:t>Led integrated Mobile and Tablet manufacturing operations across Production, Maintenance, Quality Engineering, Product Engineering, and In-house Logistics, directing approximately 320 employees.</w:t>
@@ -283,9 +263,6 @@
     <w:p>
       <w:pPr>
         <w:pStyle w:val="ListBullet"/>
-        <w:keepLines/>
-        <w:spacing w:after="20"/>
-        <w:ind w:left="259" w:hanging="173"/>
       </w:pPr>
       <w:r>
         <w:t>Increased production capacity by 16% through Lean Manufacturing and resource optimization, contributing approximately US$500K in annual operating savings.</w:t>
@@ -294,20 +271,14 @@
     <w:p>
       <w:pPr>
         <w:pStyle w:val="ListBullet"/>
-        <w:keepLines/>
-        <w:spacing w:after="20"/>
-        <w:ind w:left="259" w:hanging="173"/>
       </w:pPr>
       <w:r>
-        <w:t>Reduced machine downtime by 35% through reliability improvement and improved manufacturing defects by 22% through process control and structured problem-solving.</w:t>
+        <w:t>Reduced machine downtime by 35% through reliability improvement and improved the overall manufacturing defect rate by 22% through process control and structured problem-solving.</w:t>
       </w:r>
     </w:p>
     <w:p>
       <w:pPr>
         <w:pStyle w:val="ListBullet"/>
-        <w:keepLines/>
-        <w:spacing w:after="20"/>
-        <w:ind w:left="259" w:hanging="173"/>
       </w:pPr>
       <w:r>
         <w:t>Reduced Tablet defects from approximately 24,000 PPM to 6,000 PPM (75% reduction in Tablet defect PPM) through incoming-quality controls, defect mapping, root-cause analysis, and team engagement.</w:t>
@@ -316,75 +287,70 @@
     <w:p>
       <w:pPr>
         <w:pStyle w:val="ListBullet"/>
-        <w:keepLines/>
-        <w:spacing w:after="20"/>
-        <w:ind w:left="259" w:hanging="173"/>
       </w:pPr>
       <w:r>
-        <w:t>Managed productivity, quality, loss, scrap, delivery, and equipment KPIs and supported CEO-level manufacturing transformation initiatives.</w:t>
+        <w:t>Managed productivity, quality, loss, scrap, delivery, and equipment KPIs while supporting CEO-level manufacturing transformation initiatives.</w:t>
       </w:r>
     </w:p>
     <w:p>
       <w:pPr>
         <w:keepNext/>
-        <w:spacing w:before="64" w:after="10"/>
+        <w:pageBreakBefore/>
+        <w:spacing w:before="120"/>
       </w:pPr>
       <w:r>
         <w:rPr>
           <w:b/>
-          <w:sz w:val="19"/>
         </w:rPr>
         <w:t>Production Technology Senior Manager | Samsung Electronics Egypt</w:t>
       </w:r>
+    </w:p>
+    <w:p>
+      <w:pPr>
+        <w:keepNext/>
+      </w:pPr>
       <w:r>
         <w:rPr>
           <w:i/>
-          <w:color w:val="464646"/>
-          <w:sz w:val="17"/>
         </w:rPr>
-        <w:br/>
-        <w:t>Beni Suef, Egypt | Dec 2012 - Jul 2023</w:t>
+        <w:t>Beni Suef, Egypt | Dec 2012 – Jul 2023</w:t>
       </w:r>
     </w:p>
     <w:p>
       <w:pPr>
         <w:pStyle w:val="ListBullet"/>
-        <w:keepLines/>
-        <w:spacing w:after="20"/>
-        <w:ind w:left="259" w:hanging="173"/>
       </w:pPr>
       <w:r>
-        <w:t>Directed Production Technology and Manufacturing Engineering across TV Final Assembly, LCM, Press, and CKD/SKD/MKD operations, leading 53 engineers and technicians. Recruited, trained, and developed the founding 53-person engineering and technician organization.</w:t>
+        <w:t>Directed Production Technology and Manufacturing Engineering across TV Final Assembly, LCM, Press, and CKD/SKD/MKD operations, leading 53 engineers and technicians.</w:t>
       </w:r>
     </w:p>
     <w:p>
       <w:pPr>
         <w:pStyle w:val="ListBullet"/>
-        <w:keepLines/>
-        <w:spacing w:after="20"/>
-        <w:ind w:left="259" w:hanging="173"/>
       </w:pPr>
       <w:r>
-        <w:t>Led manufacturing setup, equipment installation, commissioning, and ramp-up of the VD facility from an empty building to mass-production readiness.</w:t>
+        <w:t>Led manufacturing setup, equipment installation, commissioning, and ramp-up of the VD facility from empty building to mass-production readiness.</w:t>
       </w:r>
     </w:p>
     <w:p>
       <w:pPr>
         <w:pStyle w:val="ListBullet"/>
-        <w:keepLines/>
-        <w:spacing w:after="20"/>
-        <w:ind w:left="259" w:hanging="173"/>
       </w:pPr>
       <w:r>
-        <w:t>Commissioned 14 production lines, including seven TV Main Assembly and seven LCM lines, and achieved the target production capacity of 12,000 units per day on schedule.</w:t>
+        <w:t>Commissioned 14 production lines, including seven TV Main Assembly and seven LCM lines, and achieved target production capacity of 12,000 units/day on schedule.</w:t>
       </w:r>
     </w:p>
     <w:p>
       <w:pPr>
         <w:pStyle w:val="ListBullet"/>
-        <w:keepLines/>
-        <w:spacing w:after="20"/>
-        <w:ind w:left="259" w:hanging="173"/>
+      </w:pPr>
+      <w:r>
+        <w:t>Recruited, trained, and developed the founding 53-person engineering and technician organization.</w:t>
+      </w:r>
+    </w:p>
+    <w:p>
+      <w:pPr>
+        <w:pStyle w:val="ListBullet"/>
       </w:pPr>
       <w:r>
         <w:t>Planned and executed deployment of 62 KUKA industrial robots across eight production lines, improving productivity and process consistency.</w:t>
@@ -393,9 +359,6 @@
     <w:p>
       <w:pPr>
         <w:pStyle w:val="ListBullet"/>
-        <w:keepLines/>
-        <w:spacing w:after="20"/>
-        <w:ind w:left="259" w:hanging="173"/>
       </w:pPr>
       <w:r>
         <w:t>Introduced AGVs for internal material transport, reducing logistics workforce requirements by 25%.</w:t>
@@ -404,9 +367,6 @@
     <w:p>
       <w:pPr>
         <w:pStyle w:val="ListBullet"/>
-        <w:keepLines/>
-        <w:spacing w:after="20"/>
-        <w:ind w:left="259" w:hanging="173"/>
       </w:pPr>
       <w:r>
         <w:t>Established Mobile and Tablet manufacturing lines on an accelerated schedule and delivered production readiness by the planned launch date.</w:t>
@@ -415,131 +375,198 @@
     <w:p>
       <w:pPr>
         <w:pStyle w:val="ListBullet"/>
-        <w:keepLines/>
-        <w:spacing w:after="20"/>
-        <w:ind w:left="259" w:hanging="173"/>
       </w:pPr>
       <w:r>
-        <w:t>Led line-expansion, layout-optimization, equipment-upgrade, and new-product-introduction projects across cross-functional teams and suppliers.</w:t>
+        <w:t>Received Samsung Global Innovation Day Awards in 2019 and 2022 for manufacturing innovation and engineering excellence.</w:t>
       </w:r>
     </w:p>
     <w:p>
       <w:pPr>
         <w:keepNext/>
-        <w:spacing w:before="64" w:after="10"/>
+        <w:spacing w:before="120"/>
       </w:pPr>
       <w:r>
         <w:rPr>
           <w:b/>
-          <w:sz w:val="19"/>
         </w:rPr>
-        <w:t>Preventive Maintenance Section Head | ASEC Automation - South Valley Cement Factory</w:t>
+        <w:t>Preventive Maintenance Section Head | ASEC Automation (ASA)</w:t>
       </w:r>
+    </w:p>
+    <w:p>
+      <w:pPr>
+        <w:keepNext/>
+      </w:pPr>
       <w:r>
         <w:rPr>
           <w:i/>
-          <w:color w:val="464646"/>
-          <w:sz w:val="17"/>
         </w:rPr>
-        <w:br/>
-        <w:t>Beni Suef, Egypt | Jul 2011 - Dec 2012</w:t>
+        <w:t>Bani Suwayf, Egypt | July 2011 – December 2012</w:t>
+      </w:r>
+    </w:p>
+    <w:p>
+      <w:pPr/>
+      <w:r>
+        <w:t>Led preventive and predictive maintenance activities at South Valley Cement Factory, supporting equipment reliability, plant availability, and maintenance cost performance.</w:t>
       </w:r>
     </w:p>
     <w:p>
       <w:pPr>
         <w:pStyle w:val="ListBullet"/>
-        <w:keepLines/>
-        <w:spacing w:after="20"/>
-        <w:ind w:left="259" w:hanging="173"/>
       </w:pPr>
       <w:r>
-        <w:t>Led preventive and predictive maintenance planning, major shutdowns, scheduled maintenance, and equipment overhauls to improve plant availability and maintenance cost performance.</w:t>
+        <w:t>Developed and implemented preventive maintenance plans for critical production equipment</w:t>
+      </w:r>
+    </w:p>
+    <w:p>
+      <w:pPr>
+        <w:pStyle w:val="ListBullet"/>
+      </w:pPr>
+      <w:r>
+        <w:t>Introduced predictive maintenance practices that reduced maintenance costs and improved intervention planning</w:t>
+      </w:r>
+    </w:p>
+    <w:p>
+      <w:pPr>
+        <w:pStyle w:val="ListBullet"/>
+      </w:pPr>
+      <w:r>
+        <w:t>Planned and coordinated major shutdowns, scheduled maintenance, and equipment overhauls</w:t>
+      </w:r>
+    </w:p>
+    <w:p>
+      <w:pPr>
+        <w:pStyle w:val="ListBullet"/>
+      </w:pPr>
+      <w:r>
+        <w:t>Worked with Operations and technical teams to prioritize maintenance activities and minimize production disruption</w:t>
+      </w:r>
+    </w:p>
+    <w:p>
+      <w:pPr>
+        <w:pStyle w:val="ListBullet"/>
+      </w:pPr>
+      <w:r>
+        <w:t>Monitored maintenance execution and equipment condition to improve reliability and resource utilization</w:t>
       </w:r>
     </w:p>
     <w:p>
       <w:pPr>
         <w:keepNext/>
-        <w:spacing w:before="64" w:after="10"/>
+        <w:spacing w:before="120"/>
       </w:pPr>
       <w:r>
         <w:rPr>
           <w:b/>
-          <w:sz w:val="19"/>
         </w:rPr>
-        <w:t>Maintenance Engineer | Dehydro Foods S.A.E.</w:t>
+        <w:t>Maintenance Engineer | DEHYDRO FOODS S.A.E</w:t>
       </w:r>
+    </w:p>
+    <w:p>
+      <w:pPr>
+        <w:keepNext/>
+      </w:pPr>
       <w:r>
         <w:rPr>
           <w:i/>
-          <w:color w:val="464646"/>
-          <w:sz w:val="17"/>
         </w:rPr>
-        <w:br/>
-        <w:t>Beni Suef, Egypt | Jul 2008 - Jul 2011</w:t>
+        <w:t>July 2008 – July 2011</w:t>
+      </w:r>
+    </w:p>
+    <w:p>
+      <w:pPr/>
+      <w:r>
+        <w:t>Supported electrical, mechanical, and control-system maintenance for a vegetables and herbs dehydration facility.</w:t>
       </w:r>
     </w:p>
     <w:p>
       <w:pPr>
         <w:pStyle w:val="ListBullet"/>
-        <w:keepLines/>
-        <w:spacing w:after="20"/>
-        <w:ind w:left="259" w:hanging="173"/>
       </w:pPr>
       <w:r>
-        <w:t>Improved productivity on two lines by converting the final dehydration stage from steam heating to a burner-based indirect heating system.</w:t>
+        <w:t>Improved productivity on two production lines by converting the final dehydration stage from steam heating to a burner-based indirect heating system</w:t>
       </w:r>
     </w:p>
     <w:p>
       <w:pPr>
         <w:pStyle w:val="ListBullet"/>
-        <w:keepLines/>
-        <w:spacing w:after="20"/>
-        <w:ind w:left="259" w:hanging="173"/>
       </w:pPr>
       <w:r>
-        <w:t>Designed a microcontroller-based control system for the industrial water-treatment unit and supported ISO, HACCP, and BRC compliance.</w:t>
+        <w:t>Designed and developed a microcontroller-based control system for the industrial water-treatment unit</w:t>
+      </w:r>
+    </w:p>
+    <w:p>
+      <w:pPr>
+        <w:pStyle w:val="ListBullet"/>
+      </w:pPr>
+      <w:r>
+        <w:t>Supported preventive and corrective maintenance activities to improve production continuity and equipment reliability</w:t>
+      </w:r>
+    </w:p>
+    <w:p>
+      <w:pPr>
+        <w:pStyle w:val="ListBullet"/>
+      </w:pPr>
+      <w:r>
+        <w:t>Coordinated maintenance-section compliance with ISO, HACCP, and BRC requirements</w:t>
       </w:r>
     </w:p>
     <w:p>
       <w:pPr>
         <w:keepNext/>
-        <w:spacing w:before="64" w:after="10"/>
+        <w:spacing w:before="120"/>
       </w:pPr>
       <w:r>
         <w:rPr>
           <w:b/>
-          <w:sz w:val="19"/>
         </w:rPr>
-        <w:t>Installation Engineer | Hanz Lifts Company</w:t>
-      </w:r>
-      <w:r>
-        <w:rPr>
-          <w:i/>
-          <w:color w:val="464646"/>
-          <w:sz w:val="17"/>
-        </w:rPr>
-        <w:br/>
-        <w:t>Giza, Egypt | Oct 2007 - Jul 2008</w:t>
+        <w:t>Installation Engineer | Hanz Lifts company</w:t>
       </w:r>
     </w:p>
     <w:p>
       <w:pPr>
-        <w:pStyle w:val="ListBullet"/>
-        <w:keepLines/>
-        <w:spacing w:after="20"/>
-        <w:ind w:left="259" w:hanging="173"/>
+        <w:keepNext/>
       </w:pPr>
+      <w:r>
+        <w:rPr>
+          <w:i/>
+        </w:rPr>
+        <w:t>Egypt | October 2007 – July 2008</w:t>
+      </w:r>
+    </w:p>
+    <w:p>
+      <w:pPr/>
       <w:r>
         <w:t>Installed and commissioned elevator control systems using Siemens S7-200 PLCs, inverters, and associated electrical-control components.</w:t>
       </w:r>
     </w:p>
     <w:p>
       <w:pPr>
+        <w:pStyle w:val="ListBullet"/>
+      </w:pPr>
+      <w:r>
+        <w:t>Supported control-panel installation, wiring, testing, and system start-up</w:t>
+      </w:r>
+    </w:p>
+    <w:p>
+      <w:pPr>
+        <w:pStyle w:val="ListBullet"/>
+      </w:pPr>
+      <w:r>
+        <w:t>Diagnosed installation and control-system issues during commissioning</w:t>
+      </w:r>
+    </w:p>
+    <w:p>
+      <w:pPr>
+        <w:pStyle w:val="ListBullet"/>
+      </w:pPr>
+      <w:r>
+        <w:t>Coordinated technical activities to ensure safe and reliable system operation</w:t>
+      </w:r>
+    </w:p>
+    <w:p>
+      <w:pPr>
         <w:keepNext/>
         <w:spacing w:before="90" w:after="50"/>
-        <w:pBdr>
-          <w:bottom w:val="single" w:sz="5" w:space="1" w:color="666666"/>
-        </w:pBdr>
       </w:pPr>
       <w:r>
         <w:rPr>
@@ -597,9 +624,6 @@
       <w:pPr>
         <w:keepNext/>
         <w:spacing w:before="90" w:after="50"/>
-        <w:pBdr>
-          <w:bottom w:val="single" w:sz="5" w:space="1" w:color="666666"/>
-        </w:pBdr>
       </w:pPr>
       <w:r>
         <w:rPr>
@@ -629,9 +653,6 @@
       <w:pPr>
         <w:keepNext/>
         <w:spacing w:before="90" w:after="50"/>
-        <w:pBdr>
-          <w:bottom w:val="single" w:sz="5" w:space="1" w:color="666666"/>
-        </w:pBdr>
       </w:pPr>
       <w:r>
         <w:rPr>
@@ -724,9 +745,6 @@
       <w:pPr>
         <w:keepNext/>
         <w:spacing w:before="90" w:after="50"/>
-        <w:pBdr>
-          <w:bottom w:val="single" w:sz="5" w:space="1" w:color="666666"/>
-        </w:pBdr>
       </w:pPr>
       <w:r>
         <w:rPr>
@@ -1489,9 +1507,6 @@
     <w:qFormat/>
     <w:rsid w:val="00FC693F"/>
     <w:pPr>
-      <w:pBdr>
-        <w:bottom w:val="single" w:sz="8" w:space="4" w:color="4F81BD" w:themeColor="accent1"/>
-      </w:pBdr>
       <w:spacing w:after="300" w:line="240" w:lineRule="auto"/>
       <w:contextualSpacing/>
     </w:pPr>
@@ -1976,9 +1991,6 @@
     <w:qFormat/>
     <w:rsid w:val="00FC693F"/>
     <w:pPr>
-      <w:pBdr>
-        <w:bottom w:val="single" w:sz="4" w:space="4" w:color="4F81BD" w:themeColor="accent1"/>
-      </w:pBdr>
       <w:spacing w:before="200" w:after="280"/>
       <w:ind w:left="936" w:right="936"/>
     </w:pPr>

</xml_diff>